<commit_message>
fix: correcciones en resultados y generación de abstract final
</commit_message>
<xml_diff>
--- a/WAIMLAP_DRAFT.docx
+++ b/WAIMLAP_DRAFT.docx
@@ -4,7 +4,8 @@
   <w:body>
     <w:p>
       <w:pPr>
-        <w:spacing w:before="0" w:after="120" w:line="240" w:lineRule="auto"/>
+        <w:spacing w:after="120"/>
+        <w:jc w:val="center"/>
       </w:pPr>
       <w:r>
         <w:rPr>
@@ -16,9 +17,6 @@
       </w:r>
     </w:p>
     <w:p>
-      <w:pPr>
-        <w:spacing w:before="0" w:after="60" w:line="240" w:lineRule="auto"/>
-      </w:pPr>
       <w:r>
         <w:rPr>
           <w:rFonts w:ascii="Calibri" w:hAnsi="Calibri"/>
@@ -30,12 +28,11 @@
     </w:p>
     <w:p>
       <w:pPr>
-        <w:spacing w:before="0" w:after="120" w:line="240" w:lineRule="auto"/>
+        <w:spacing w:after="120"/>
       </w:pPr>
       <w:r>
         <w:rPr>
           <w:rFonts w:ascii="Calibri" w:hAnsi="Calibri"/>
-          <w:b w:val="0"/>
           <w:sz w:val="17"/>
         </w:rPr>
         <w:t>[Affiliations pending confirmation] | Corresponding author: [pending confirmation]</w:t>
@@ -44,7 +41,7 @@
     <w:p>
       <w:pPr>
         <w:keepNext/>
-        <w:spacing w:before="100" w:after="60" w:line="240" w:lineRule="auto"/>
+        <w:spacing w:before="100"/>
       </w:pPr>
       <w:r>
         <w:rPr>
@@ -57,21 +54,31 @@
     </w:p>
     <w:p>
       <w:pPr>
-        <w:spacing w:before="0" w:after="80" w:line="240" w:lineRule="auto"/>
+        <w:spacing w:after="80"/>
+        <w:jc w:val="both"/>
+        <w:rPr>
+          <w:rFonts w:ascii="Calibri" w:hAnsi="Calibri"/>
+          <w:sz w:val="22"/>
+        </w:rPr>
       </w:pPr>
       <w:r>
         <w:rPr>
           <w:rFonts w:ascii="Calibri" w:hAnsi="Calibri"/>
-          <w:b w:val="0"/>
           <w:sz w:val="22"/>
         </w:rPr>
-        <w:t>Removing spatial prompts from Segment Anything (SAM) changes both localization and target specification. For polyp segmentation, a useful diagnosis must distinguish missing mask candidates from failure to select a good candidate. Building on SAM [1], polyp evaluations [2], and automatic prompting [3, 4], we study quality lost when spatial information is removed or degraded, automatic replacements, label efficiency, external transfer, false activation, and computational cost. Human annotation time is not measured; the contribution is controlled empirical evidence rather than a new prompting architecture.</w:t>
+        <w:t>Removing spatial prompts from Segment Anything (SAM) [1] changes both localization and target specification. For polyp segmentation, a useful diagnosis must distinguish missing mask candidates from failure to select a good candidate. Prior work shows that SAM struggles on polyps without prompts [2], that its chosen mask can trail the best available one [3], that it is sensitive to imprecise prompts [4, 5], and that prompts can be generated automatically [6, 7]. We combine these threads under shared image IDs: quality lost when spatial information is removed or degraded, automatic replacements, label efficiency, external transfer, false activation, and computational cost. Human annotation time is not measured; the contribution is controlled empirical evidence rather than a new prompting architecture.</w:t>
       </w:r>
     </w:p>
     <w:p>
       <w:pPr>
+        <w:spacing w:after="80"/>
+        <w:jc w:val="both"/>
+      </w:pPr>
+    </w:p>
+    <w:p>
+      <w:pPr>
         <w:keepNext/>
-        <w:spacing w:before="100" w:after="60" w:line="240" w:lineRule="auto"/>
+        <w:spacing w:before="100"/>
       </w:pPr>
       <w:r>
         <w:rPr>
@@ -84,89 +91,112 @@
     </w:p>
     <w:p>
       <w:pPr>
-        <w:spacing w:before="0" w:after="80" w:line="240" w:lineRule="auto"/>
+        <w:spacing w:after="80"/>
+        <w:jc w:val="both"/>
+        <w:rPr>
+          <w:rFonts w:ascii="Calibri" w:hAnsi="Calibri"/>
+          <w:sz w:val="22"/>
+        </w:rPr>
       </w:pPr>
       <w:r>
         <w:rPr>
           <w:rFonts w:ascii="Calibri" w:hAnsi="Calibri"/>
-          <w:b w:val="0"/>
           <w:sz w:val="22"/>
         </w:rPr>
-        <w:t>We use a fixed 400-image training subset and 100 development images from Kvasir-SEG [5]. SAM ViT-B is frozen and uses FP32 at longest-side input 1024. Conditions include empty spatial input, oracle GT points and boxes, prompt perturbations, output selection, static and image-conditioned tokens, a 257-parameter linear probe over frozen image features, and probe-derived box/point prompts. A fixed spatial prior uses median normalized training-mask coordinates. Oracle prompts can reveal component count and are diagnostic ceilings.</w:t>
+        <w:t xml:space="preserve">We use a fixed 400-image training subset and 100 development images from Kvasir-SEG [8]. SAM </w:t>
+      </w:r>
+      <w:proofErr w:type="spellStart"/>
+      <w:r>
+        <w:rPr>
+          <w:rFonts w:ascii="Calibri" w:hAnsi="Calibri"/>
+          <w:sz w:val="22"/>
+        </w:rPr>
+        <w:t>ViT</w:t>
+      </w:r>
+      <w:proofErr w:type="spellEnd"/>
+      <w:r>
+        <w:rPr>
+          <w:rFonts w:ascii="Calibri" w:hAnsi="Calibri"/>
+          <w:sz w:val="22"/>
+        </w:rPr>
+        <w:t>-B is frozen and uses FP32 at longest-side input 1024. Conditions include empty spatial input, oracle GT points and boxes, prompt perturbations, output selection, static and image-conditioned tokens, a 257-parameter linear probe over frozen image features, and probe-derived box/point prompts. A fixed spatial prior uses median normalized training-mask coordinates. Oracle prompts can reveal component count and are diagnostic ceilings.</w:t>
       </w:r>
     </w:p>
     <w:p>
       <w:pPr>
-        <w:spacing w:before="0" w:after="80" w:line="240" w:lineRule="auto"/>
+        <w:spacing w:after="80"/>
+        <w:jc w:val="both"/>
+        <w:rPr>
+          <w:rFonts w:ascii="Calibri" w:hAnsi="Calibri"/>
+          <w:sz w:val="22"/>
+        </w:rPr>
       </w:pPr>
       <w:r>
         <w:rPr>
           <w:rFonts w:ascii="Calibri" w:hAnsi="Calibri"/>
-          <w:b w:val="0"/>
           <w:sz w:val="22"/>
         </w:rPr>
-        <w:t>A compact U-Net [6] is trained from scratch and continued for 15 fixed epochs at 128 or 256 pixels from identical epoch-30 weights, Adam states, and RNG states. A label-efficiency study uses nested 25/100/400-image subsets and fixed update counts (300 probe; 1,500 U-Net). Seeds 0/1/2 are used. Development intervals bootstrap images after averaging seeds; model and threshold selection uses development data.</w:t>
+        <w:t>A compact U-Net [9] (487k parameters) is trained from scratch for 30 epochs at 128 pixels, then continued for 15 epochs at 128 or 256 pixels from identical weights, Adam states, and RNG states. A label-efficiency study uses nested 25/100/400-image subsets and fixed update budgets (300 probe; 1,500 U-Net, directly at 256 pixels). Seeds 0/1/2 are used. Development intervals bootstrap images after averaging seeds; model and threshold selection uses development data.</w:t>
       </w:r>
     </w:p>
     <w:p>
       <w:pPr>
-        <w:spacing w:before="0" w:after="80" w:line="240" w:lineRule="auto"/>
+        <w:spacing w:after="80"/>
+        <w:jc w:val="both"/>
+        <w:rPr>
+          <w:rFonts w:ascii="Calibri" w:hAnsi="Calibri"/>
+          <w:sz w:val="22"/>
+        </w:rPr>
       </w:pPr>
       <w:r>
         <w:rPr>
           <w:rFonts w:ascii="Calibri" w:hAnsi="Calibri"/>
-          <w:b w:val="0"/>
           <w:sz w:val="22"/>
         </w:rPr>
-        <w:t>Frozen models are applied without adaptation to 612 CVC-ClinicDB frames from 29 sequences [7], with sequence-clustered intervals. False activation is measured on all 1,009 HyperKvasir cecum-class images [8] using predicted area and component size. Those class labels are a negative proxy, not pixel-reviewed negative masks; patient/video IDs are unavailable. CPU latency includes the full RGB-to-mask pipeline.</w:t>
+        <w:t>Frozen models are applied without adaptation to 612 CVC-</w:t>
+      </w:r>
+      <w:proofErr w:type="spellStart"/>
+      <w:r>
+        <w:rPr>
+          <w:rFonts w:ascii="Calibri" w:hAnsi="Calibri"/>
+          <w:sz w:val="22"/>
+        </w:rPr>
+        <w:t>ClinicDB</w:t>
+      </w:r>
+      <w:proofErr w:type="spellEnd"/>
+      <w:r>
+        <w:rPr>
+          <w:rFonts w:ascii="Calibri" w:hAnsi="Calibri"/>
+          <w:sz w:val="22"/>
+        </w:rPr>
+        <w:t xml:space="preserve"> frames from 29 sequences [10], with sequence-clustered intervals. False activation is measured on all 1,009 </w:t>
+      </w:r>
+      <w:proofErr w:type="spellStart"/>
+      <w:r>
+        <w:rPr>
+          <w:rFonts w:ascii="Calibri" w:hAnsi="Calibri"/>
+          <w:sz w:val="22"/>
+        </w:rPr>
+        <w:t>HyperKvasir</w:t>
+      </w:r>
+      <w:proofErr w:type="spellEnd"/>
+      <w:r>
+        <w:rPr>
+          <w:rFonts w:ascii="Calibri" w:hAnsi="Calibri"/>
+          <w:sz w:val="22"/>
+        </w:rPr>
+        <w:t xml:space="preserve"> cecum-class images [11] using predicted area and component size. Those class labels are a negative proxy, not pixel-reviewed negative masks; patient/video IDs are unavailable. CPU latency includes the full RGB-to-mask pipeline.</w:t>
       </w:r>
     </w:p>
     <w:p>
       <w:pPr>
-        <w:pageBreakBefore/>
-        <w:spacing w:before="0" w:after="120"/>
-        <w:jc w:val="center"/>
+        <w:spacing w:after="80"/>
       </w:pPr>
-      <w:r>
-        <w:drawing>
-          <wp:inline xmlns:a="http://schemas.openxmlformats.org/drawingml/2006/main" xmlns:pic="http://schemas.openxmlformats.org/drawingml/2006/picture">
-            <wp:extent cx="6263640" cy="549004"/>
-            <wp:docPr id="2" name="Picture 2"/>
-            <wp:cNvGraphicFramePr>
-              <a:graphicFrameLocks noChangeAspect="1"/>
-            </wp:cNvGraphicFramePr>
-            <a:graphic>
-              <a:graphicData uri="http://schemas.openxmlformats.org/drawingml/2006/picture">
-                <pic:pic>
-                  <pic:nvPicPr>
-                    <pic:cNvPr id="0" name="header_strip.png"/>
-                    <pic:cNvPicPr/>
-                  </pic:nvPicPr>
-                  <pic:blipFill>
-                    <a:blip r:embed="rId13"/>
-                    <a:stretch>
-                      <a:fillRect/>
-                    </a:stretch>
-                  </pic:blipFill>
-                  <pic:spPr>
-                    <a:xfrm>
-                      <a:off x="0" y="0"/>
-                      <a:ext cx="6263640" cy="549004"/>
-                    </a:xfrm>
-                    <a:prstGeom prst="rect"/>
-                  </pic:spPr>
-                </pic:pic>
-              </a:graphicData>
-            </a:graphic>
-          </wp:inline>
-        </w:drawing>
-      </w:r>
     </w:p>
     <w:p>
       <w:pPr>
         <w:keepNext/>
-        <w:pageBreakBefore w:val="0"/>
-        <w:spacing w:before="100" w:after="60" w:line="240" w:lineRule="auto"/>
+        <w:spacing w:before="100"/>
       </w:pPr>
       <w:r>
         <w:rPr>
@@ -179,55 +209,240 @@
     </w:p>
     <w:p>
       <w:pPr>
-        <w:spacing w:before="0" w:after="80" w:line="240" w:lineRule="auto"/>
+        <w:spacing w:after="80"/>
+        <w:jc w:val="both"/>
+        <w:rPr>
+          <w:rFonts w:ascii="Calibri" w:hAnsi="Calibri"/>
+          <w:sz w:val="22"/>
+        </w:rPr>
       </w:pPr>
       <w:r>
         <w:rPr>
           <w:rFonts w:ascii="Calibri" w:hAnsi="Calibri"/>
-          <w:b w:val="0"/>
           <w:sz w:val="22"/>
         </w:rPr>
-        <w:t>Empty input nearly collapses (Dice 0.0089), while oracle points/boxes reach 0.6831/0.9352. Static tokens recover 0.3633, conditioned tokens 0.5013, and the probe 0.7489. Probe-derived box+point prompts raise Dice to 0.8179 (+0.0690 [0.0471, 0.0919]); a fixed train prior reaches only 0.3582, identifying image-specific localization as the main source of recovery.</w:t>
+        <w:t xml:space="preserve">Empty input nearly collapses (Dice 0.0089), while oracle points/boxes reach 0.6831/0.9352. Static tokens recover 0.3633, whose </w:t>
+      </w:r>
+      <w:proofErr w:type="gramStart"/>
+      <w:r>
+        <w:rPr>
+          <w:rFonts w:ascii="Calibri" w:hAnsi="Calibri"/>
+          <w:sz w:val="22"/>
+        </w:rPr>
+        <w:t>mean</w:t>
+      </w:r>
+      <w:proofErr w:type="gramEnd"/>
+      <w:r>
+        <w:rPr>
+          <w:rFonts w:ascii="Calibri" w:hAnsi="Calibri"/>
+          <w:sz w:val="22"/>
+        </w:rPr>
+        <w:t xml:space="preserve"> matches a fixed train-derived point (0.3633); conditioned tokens reach 0.5013, but permuting their image context lowers Dice by only 0.0060. The probe reaches 0.7489, and probe-derived </w:t>
+      </w:r>
+      <w:proofErr w:type="spellStart"/>
+      <w:r>
+        <w:rPr>
+          <w:rFonts w:ascii="Calibri" w:hAnsi="Calibri"/>
+          <w:sz w:val="22"/>
+        </w:rPr>
+        <w:t>box+point</w:t>
+      </w:r>
+      <w:proofErr w:type="spellEnd"/>
+      <w:r>
+        <w:rPr>
+          <w:rFonts w:ascii="Calibri" w:hAnsi="Calibri"/>
+          <w:sz w:val="22"/>
+        </w:rPr>
+        <w:t xml:space="preserve"> prompts raise Dice to 0.8179 (+0.0690 [0.0471, 0.0919]); a fixed train </w:t>
+      </w:r>
+      <w:proofErr w:type="spellStart"/>
+      <w:r>
+        <w:rPr>
+          <w:rFonts w:ascii="Calibri" w:hAnsi="Calibri"/>
+          <w:sz w:val="22"/>
+        </w:rPr>
+        <w:t>box+point</w:t>
+      </w:r>
+      <w:proofErr w:type="spellEnd"/>
+      <w:r>
+        <w:rPr>
+          <w:rFonts w:ascii="Calibri" w:hAnsi="Calibri"/>
+          <w:sz w:val="22"/>
+        </w:rPr>
+        <w:t xml:space="preserve"> prior reaches only 0.3582, identifying image-specific localization as the main source of recovery.</w:t>
       </w:r>
     </w:p>
     <w:p>
       <w:pPr>
-        <w:spacing w:before="0" w:after="80" w:line="240" w:lineRule="auto"/>
+        <w:spacing w:after="80"/>
+        <w:jc w:val="both"/>
+        <w:rPr>
+          <w:rFonts w:ascii="Calibri" w:hAnsi="Calibri"/>
+          <w:sz w:val="22"/>
+        </w:rPr>
       </w:pPr>
       <w:r>
         <w:rPr>
           <w:rFonts w:ascii="Calibri" w:hAnsi="Calibri"/>
-          <w:b w:val="0"/>
           <w:sz w:val="22"/>
         </w:rPr>
-        <w:t>Candidate availability and selection fail differently: with empty input, the best of four outputs reaches only 0.1824; with a correct point, the best of three reaches 0.8600 versus 0.5401 under predicted-IoU selection. Ranking cannot repair missing candidates, but has headroom after localization.</w:t>
+        <w:t xml:space="preserve">Candidate availability and selection fail differently: with empty input, the </w:t>
+      </w:r>
+      <w:proofErr w:type="gramStart"/>
+      <w:r>
+        <w:rPr>
+          <w:rFonts w:ascii="Calibri" w:hAnsi="Calibri"/>
+          <w:sz w:val="22"/>
+        </w:rPr>
+        <w:t>best of four</w:t>
+      </w:r>
+      <w:proofErr w:type="gramEnd"/>
+      <w:r>
+        <w:rPr>
+          <w:rFonts w:ascii="Calibri" w:hAnsi="Calibri"/>
+          <w:sz w:val="22"/>
+        </w:rPr>
+        <w:t xml:space="preserve"> outputs reaches only 0.1824; with a correct point, the </w:t>
+      </w:r>
+      <w:proofErr w:type="gramStart"/>
+      <w:r>
+        <w:rPr>
+          <w:rFonts w:ascii="Calibri" w:hAnsi="Calibri"/>
+          <w:sz w:val="22"/>
+        </w:rPr>
+        <w:t>best of three</w:t>
+      </w:r>
+      <w:proofErr w:type="gramEnd"/>
+      <w:r>
+        <w:rPr>
+          <w:rFonts w:ascii="Calibri" w:hAnsi="Calibri"/>
+          <w:sz w:val="22"/>
+        </w:rPr>
+        <w:t xml:space="preserve"> reaches 0.8600 versus 0.5401 under </w:t>
+      </w:r>
+      <w:proofErr w:type="gramStart"/>
+      <w:r>
+        <w:rPr>
+          <w:rFonts w:ascii="Calibri" w:hAnsi="Calibri"/>
+          <w:sz w:val="22"/>
+        </w:rPr>
+        <w:t>predicted-</w:t>
+      </w:r>
+      <w:proofErr w:type="spellStart"/>
+      <w:r>
+        <w:rPr>
+          <w:rFonts w:ascii="Calibri" w:hAnsi="Calibri"/>
+          <w:sz w:val="22"/>
+        </w:rPr>
+        <w:t>IoU</w:t>
+      </w:r>
+      <w:proofErr w:type="spellEnd"/>
+      <w:proofErr w:type="gramEnd"/>
+      <w:r>
+        <w:rPr>
+          <w:rFonts w:ascii="Calibri" w:hAnsi="Calibri"/>
+          <w:sz w:val="22"/>
+        </w:rPr>
+        <w:t xml:space="preserve"> selection. Ranking cannot repair missing </w:t>
+      </w:r>
+      <w:proofErr w:type="gramStart"/>
+      <w:r>
+        <w:rPr>
+          <w:rFonts w:ascii="Calibri" w:hAnsi="Calibri"/>
+          <w:sz w:val="22"/>
+        </w:rPr>
+        <w:t>candidates, but</w:t>
+      </w:r>
+      <w:proofErr w:type="gramEnd"/>
+      <w:r>
+        <w:rPr>
+          <w:rFonts w:ascii="Calibri" w:hAnsi="Calibri"/>
+          <w:sz w:val="22"/>
+        </w:rPr>
+        <w:t xml:space="preserve"> has headroom after localization.</w:t>
       </w:r>
     </w:p>
     <w:p>
       <w:pPr>
-        <w:spacing w:before="0" w:after="80" w:line="240" w:lineRule="auto"/>
+        <w:spacing w:after="80"/>
+        <w:jc w:val="both"/>
+        <w:rPr>
+          <w:rFonts w:ascii="Calibri" w:hAnsi="Calibri"/>
+          <w:sz w:val="22"/>
+        </w:rPr>
       </w:pPr>
       <w:r>
         <w:rPr>
           <w:rFonts w:ascii="Calibri" w:hAnsi="Calibri"/>
-          <w:b w:val="0"/>
           <w:sz w:val="22"/>
         </w:rPr>
-        <w:t>U-Net 256 reaches 0.8267; SAM−U-Net is −0.0088 [−0.0472, 0.0281], resolving neither superiority nor equivalence. With fixed optimization, SAM exceeds U-Net by +0.2718, +0.1863, and +0.1226 at 25, 100, and 400 masks (all CIs exclude zero), providing a stronger low-label starting point.</w:t>
+        <w:t>The longer U-Net recipe at 256 pixels reaches 0.8267; SAM−U-Net is −0.0088 [−0.0472, 0.0281], resolving neither superiority nor equivalence. Under the fixed 1,500-update budget, SAM exceeds U-Net by +0.2718, +0.1863, and +0.1226 at 25, 100, and 400 masks (all CIs exclude zero). The 400-mask gap reflects that budget, since the longer recipe closes it with the same masks: SAM offers a stronger start when labels or training are limited, not a higher ceiling.</w:t>
       </w:r>
     </w:p>
     <w:p>
       <w:pPr>
-        <w:spacing w:before="0" w:after="80" w:line="240" w:lineRule="auto"/>
+        <w:spacing w:after="80"/>
+        <w:jc w:val="both"/>
+        <w:rPr>
+          <w:rFonts w:ascii="Calibri" w:hAnsi="Calibri"/>
+          <w:sz w:val="22"/>
+        </w:rPr>
       </w:pPr>
       <w:r>
         <w:rPr>
           <w:rFonts w:ascii="Calibri" w:hAnsi="Calibri"/>
-          <w:b w:val="0"/>
           <w:sz w:val="22"/>
         </w:rPr>
-        <w:t>On CVC-ClinicDB, Dice falls to 0.4587 for SAM and 0.3405 for U-Net (difference +0.1182 [0.0672, 0.1684]). On HyperKvasir negatives, mean false area is 0.0521 versus 0.1733 (difference −0.1212 [−0.1267, −0.1159]), yet both produce masks in over 99.8% of images. SAM transfers better but neither supports clinical adequacy. Median CPU latency is 8.37 s versus 27.08 ms.</w:t>
+        <w:lastRenderedPageBreak/>
+        <w:t>On CVC-</w:t>
       </w:r>
+      <w:proofErr w:type="spellStart"/>
+      <w:r>
+        <w:rPr>
+          <w:rFonts w:ascii="Calibri" w:hAnsi="Calibri"/>
+          <w:sz w:val="22"/>
+        </w:rPr>
+        <w:t>ClinicDB</w:t>
+      </w:r>
+      <w:proofErr w:type="spellEnd"/>
+      <w:r>
+        <w:rPr>
+          <w:rFonts w:ascii="Calibri" w:hAnsi="Calibri"/>
+          <w:sz w:val="22"/>
+        </w:rPr>
+        <w:t xml:space="preserve">, Dice falls to 0.4587 for SAM and 0.3405 for U-Net (difference +0.1182 [0.0672, 0.1684]). On </w:t>
+      </w:r>
+      <w:proofErr w:type="spellStart"/>
+      <w:r>
+        <w:rPr>
+          <w:rFonts w:ascii="Calibri" w:hAnsi="Calibri"/>
+          <w:sz w:val="22"/>
+        </w:rPr>
+        <w:t>HyperKvasir</w:t>
+      </w:r>
+      <w:proofErr w:type="spellEnd"/>
+      <w:r>
+        <w:rPr>
+          <w:rFonts w:ascii="Calibri" w:hAnsi="Calibri"/>
+          <w:sz w:val="22"/>
+        </w:rPr>
+        <w:t xml:space="preserve"> negatives, mean false area is 0.0521 versus 0.1733 (difference −0.1212 [−0.1267, −0.1159]); the gap persists if U-Net keeps only its largest component (0.1558). The probe fires on every negative image, so the always-prompt SAM pipeline always emits a mask, and its decoder enlarges the prompted component (+0.0136, post hoc); U-Net emits masks in 99.83% of images. SAM transfers better, but neither result supports clinical adequacy. Median CPU latency is 8.37 s versus 27.08 </w:t>
+      </w:r>
+      <w:proofErr w:type="spellStart"/>
+      <w:r>
+        <w:rPr>
+          <w:rFonts w:ascii="Calibri" w:hAnsi="Calibri"/>
+          <w:sz w:val="22"/>
+        </w:rPr>
+        <w:t>ms.</w:t>
+      </w:r>
+      <w:proofErr w:type="spellEnd"/>
+    </w:p>
+    <w:p>
+      <w:pPr>
+        <w:spacing w:after="80"/>
+        <w:jc w:val="both"/>
+      </w:pPr>
     </w:p>
     <w:p>
       <w:pPr>
@@ -236,21 +451,22 @@
       </w:pPr>
       <w:r>
         <w:drawing>
-          <wp:inline xmlns:a="http://schemas.openxmlformats.org/drawingml/2006/main" xmlns:pic="http://schemas.openxmlformats.org/drawingml/2006/picture">
-            <wp:extent cx="5989320" cy="1468088"/>
-            <wp:docPr id="1" name="Picture 1"/>
+          <wp:inline distT="0" distB="0" distL="0" distR="0" wp14:anchorId="274AEE25" wp14:editId="1609EA98">
+            <wp:extent cx="5759450" cy="1411605"/>
+            <wp:effectExtent l="0" t="0" r="0" b="0"/>
+            <wp:docPr id="1860008196" name="Imagen 1"/>
             <wp:cNvGraphicFramePr>
-              <a:graphicFrameLocks noChangeAspect="1"/>
+              <a:graphicFrameLocks xmlns:a="http://schemas.openxmlformats.org/drawingml/2006/main" noChangeAspect="1"/>
             </wp:cNvGraphicFramePr>
-            <a:graphic>
+            <a:graphic xmlns:a="http://schemas.openxmlformats.org/drawingml/2006/main">
               <a:graphicData uri="http://schemas.openxmlformats.org/drawingml/2006/picture">
-                <pic:pic>
+                <pic:pic xmlns:pic="http://schemas.openxmlformats.org/drawingml/2006/picture">
                   <pic:nvPicPr>
-                    <pic:cNvPr id="0" name="figure_experimental_summary.png"/>
+                    <pic:cNvPr id="1860008196" name=""/>
                     <pic:cNvPicPr/>
                   </pic:nvPicPr>
                   <pic:blipFill>
-                    <a:blip r:embed="rId12"/>
+                    <a:blip r:embed="rId8"/>
                     <a:stretch>
                       <a:fillRect/>
                     </a:stretch>
@@ -258,9 +474,11 @@
                   <pic:spPr>
                     <a:xfrm>
                       <a:off x="0" y="0"/>
-                      <a:ext cx="5989320" cy="1468088"/>
+                      <a:ext cx="5759450" cy="1411605"/>
                     </a:xfrm>
-                    <a:prstGeom prst="rect"/>
+                    <a:prstGeom prst="rect">
+                      <a:avLst/>
+                    </a:prstGeom>
                   </pic:spPr>
                 </pic:pic>
               </a:graphicData>
@@ -271,13 +489,11 @@
     </w:p>
     <w:p>
       <w:pPr>
-        <w:spacing w:before="0" w:after="60" w:line="240" w:lineRule="auto"/>
         <w:jc w:val="center"/>
       </w:pPr>
       <w:r>
         <w:rPr>
           <w:rFonts w:ascii="Calibri" w:hAnsi="Calibri"/>
-          <w:b w:val="0"/>
           <w:sz w:val="17"/>
         </w:rPr>
         <w:t>Figure 1. Prompt dependence, label efficiency, frozen positive transfer, and negative false activation. Error bars show 95% bootstrap intervals; negative-panel labels give the rate with at least 1% false area.</w:t>
@@ -286,7 +502,7 @@
     <w:p>
       <w:pPr>
         <w:keepNext/>
-        <w:spacing w:before="100" w:after="60" w:line="240" w:lineRule="auto"/>
+        <w:spacing w:before="100"/>
       </w:pPr>
       <w:r>
         <w:rPr>
@@ -299,21 +515,47 @@
     </w:p>
     <w:p>
       <w:pPr>
-        <w:spacing w:before="0" w:after="80" w:line="240" w:lineRule="auto"/>
+        <w:spacing w:after="80"/>
+        <w:jc w:val="both"/>
+        <w:rPr>
+          <w:rFonts w:ascii="Calibri" w:hAnsi="Calibri"/>
+          <w:sz w:val="22"/>
+        </w:rPr>
       </w:pPr>
       <w:r>
         <w:rPr>
           <w:rFonts w:ascii="Calibri" w:hAnsi="Calibri"/>
-          <w:b w:val="0"/>
           <w:sz w:val="22"/>
         </w:rPr>
-        <w:t>Image-specific localization recovers much of SAM's prompt gap, and its decoder improves a coarse probe. U-Net matches Kvasir development quality at far lower cost, whereas SAM is more label-efficient and transfers better externally. Both fail to reject target absence. The contribution is an integrated diagnosis of prompt dependence, candidate generation/selection, utility, and cost—not architectural novelty. Next, an abstention gate should be evaluated on grouped negative videos.</w:t>
+        <w:t>Image-specific localization recovers much of SAM's prompt gap, and its decoder improves a coarse probe. A U-Net reaches comparable Kvasir development Dice (difference unresolved) with about 300 times lower CPU latency, whereas SAM starts higher with few labels or short training and transfers better to CVC-</w:t>
+      </w:r>
+      <w:proofErr w:type="spellStart"/>
+      <w:r>
+        <w:rPr>
+          <w:rFonts w:ascii="Calibri" w:hAnsi="Calibri"/>
+          <w:sz w:val="22"/>
+        </w:rPr>
+        <w:t>ClinicDB</w:t>
+      </w:r>
+      <w:proofErr w:type="spellEnd"/>
+      <w:r>
+        <w:rPr>
+          <w:rFonts w:ascii="Calibri" w:hAnsi="Calibri"/>
+          <w:sz w:val="22"/>
+        </w:rPr>
+        <w:t>. Neither rejects target absence. The contribution is an integrated diagnosis of prompt dependence, candidate generation/selection, utility, and cost under shared IDs—not architectural novelty. Next, a presence/abstention gate should be evaluated on grouped negative videos.</w:t>
       </w:r>
     </w:p>
     <w:p>
       <w:pPr>
+        <w:spacing w:after="80"/>
+        <w:jc w:val="both"/>
+      </w:pPr>
+    </w:p>
+    <w:p>
+      <w:pPr>
         <w:keepNext/>
-        <w:spacing w:before="100" w:after="60" w:line="240" w:lineRule="auto"/>
+        <w:spacing w:before="100"/>
       </w:pPr>
       <w:r>
         <w:rPr>
@@ -326,124 +568,322 @@
     </w:p>
     <w:p>
       <w:pPr>
-        <w:spacing w:before="0" w:after="40" w:line="240" w:lineRule="auto"/>
+        <w:spacing w:after="40"/>
+        <w:rPr>
+          <w:rFonts w:ascii="Calibri" w:hAnsi="Calibri"/>
+          <w:sz w:val="18"/>
+        </w:rPr>
       </w:pPr>
       <w:r>
         <w:rPr>
           <w:rFonts w:ascii="Calibri" w:hAnsi="Calibri"/>
-          <w:b w:val="0"/>
           <w:sz w:val="18"/>
         </w:rPr>
-        <w:t>[1] A. Kirillov et al., “Segment Anything,” ICCV, 2023.</w:t>
+        <w:t>[1] A. Kirillov et al., “Segment Anything,” in Proc. ICCV, 2023.</w:t>
       </w:r>
     </w:p>
     <w:p>
       <w:pPr>
-        <w:spacing w:before="0" w:after="40" w:line="240" w:lineRule="auto"/>
+        <w:spacing w:after="40"/>
+        <w:rPr>
+          <w:rFonts w:ascii="Calibri" w:hAnsi="Calibri"/>
+          <w:sz w:val="18"/>
+        </w:rPr>
       </w:pPr>
       <w:r>
         <w:rPr>
           <w:rFonts w:ascii="Calibri" w:hAnsi="Calibri"/>
-          <w:b w:val="0"/>
           <w:sz w:val="18"/>
         </w:rPr>
-        <w:t>[2] T. Zhou et al., “Can SAM Segment Polyps?,” arXiv:2304.07583, 2023.</w:t>
+        <w:t xml:space="preserve">[2] T. Zhou et al., “Can SAM Segment </w:t>
+      </w:r>
+      <w:proofErr w:type="gramStart"/>
+      <w:r>
+        <w:rPr>
+          <w:rFonts w:ascii="Calibri" w:hAnsi="Calibri"/>
+          <w:sz w:val="18"/>
+        </w:rPr>
+        <w:t>Polyps?,</w:t>
+      </w:r>
+      <w:proofErr w:type="gramEnd"/>
+      <w:r>
+        <w:rPr>
+          <w:rFonts w:ascii="Calibri" w:hAnsi="Calibri"/>
+          <w:sz w:val="18"/>
+        </w:rPr>
+        <w:t>” arXiv:2304.07583, 2023.</w:t>
       </w:r>
     </w:p>
     <w:p>
       <w:pPr>
-        <w:spacing w:before="0" w:after="40" w:line="240" w:lineRule="auto"/>
+        <w:spacing w:after="40"/>
+        <w:rPr>
+          <w:rFonts w:ascii="Calibri" w:hAnsi="Calibri"/>
+          <w:sz w:val="18"/>
+        </w:rPr>
       </w:pPr>
       <w:r>
         <w:rPr>
           <w:rFonts w:ascii="Calibri" w:hAnsi="Calibri"/>
-          <w:b w:val="0"/>
           <w:sz w:val="18"/>
         </w:rPr>
-        <w:t>[3] Q. Wu et al., “Self-Prompting,” arXiv:2308.07624, 2023.</w:t>
+        <w:t>[3] M. A. Mazurowski et al., “Segment Anything Model for Medical Image Analysis: An Experimental Study,” Medical Image Analysis, 102918, 2023.</w:t>
       </w:r>
     </w:p>
     <w:p>
       <w:pPr>
-        <w:spacing w:before="0" w:after="40" w:line="240" w:lineRule="auto"/>
+        <w:spacing w:after="40"/>
+        <w:rPr>
+          <w:rFonts w:ascii="Calibri" w:hAnsi="Calibri"/>
+          <w:sz w:val="18"/>
+        </w:rPr>
       </w:pPr>
       <w:r>
         <w:rPr>
           <w:rFonts w:ascii="Calibri" w:hAnsi="Calibri"/>
-          <w:b w:val="0"/>
           <w:sz w:val="18"/>
         </w:rPr>
-        <w:t>[4] T. Shaharabany et al., “AutoSAM,” arXiv:2306.06370, 2023.</w:t>
+        <w:t>[4] M. M. Rahman et al., “PP-SAM: Perturbed Prompts for Robust Adaptation of Segment Anything Model for Polyp Segmentation,” in Proc. CVPR Workshops, 2024.</w:t>
       </w:r>
     </w:p>
     <w:p>
       <w:pPr>
-        <w:spacing w:before="0" w:after="40" w:line="240" w:lineRule="auto"/>
+        <w:spacing w:after="40"/>
+        <w:rPr>
+          <w:rFonts w:ascii="Calibri" w:hAnsi="Calibri"/>
+          <w:sz w:val="18"/>
+        </w:rPr>
       </w:pPr>
       <w:r>
         <w:rPr>
           <w:rFonts w:ascii="Calibri" w:hAnsi="Calibri"/>
-          <w:b w:val="0"/>
           <w:sz w:val="18"/>
         </w:rPr>
-        <w:t>[5] D. Jha et al., “Kvasir-SEG: A Segmented Polyp Dataset,” MMM, 2020.</w:t>
+        <w:t>[5] Q. Fan et al., “Stable Segment Anything Model,” arXiv:2311.15776, 2023.</w:t>
       </w:r>
     </w:p>
     <w:p>
       <w:pPr>
-        <w:spacing w:before="0" w:after="40" w:line="240" w:lineRule="auto"/>
+        <w:spacing w:after="40"/>
+        <w:rPr>
+          <w:rFonts w:ascii="Calibri" w:hAnsi="Calibri"/>
+          <w:sz w:val="18"/>
+        </w:rPr>
       </w:pPr>
       <w:r>
         <w:rPr>
           <w:rFonts w:ascii="Calibri" w:hAnsi="Calibri"/>
-          <w:b w:val="0"/>
           <w:sz w:val="18"/>
         </w:rPr>
-        <w:t>[6] O. Ronneberger et al., “U-Net,” MICCAI, 2015.</w:t>
+        <w:t xml:space="preserve">[6] Q. Wu, Y. Zhang, and M. </w:t>
+      </w:r>
+      <w:proofErr w:type="spellStart"/>
+      <w:r>
+        <w:rPr>
+          <w:rFonts w:ascii="Calibri" w:hAnsi="Calibri"/>
+          <w:sz w:val="18"/>
+        </w:rPr>
+        <w:t>Elbatel</w:t>
+      </w:r>
+      <w:proofErr w:type="spellEnd"/>
+      <w:r>
+        <w:rPr>
+          <w:rFonts w:ascii="Calibri" w:hAnsi="Calibri"/>
+          <w:sz w:val="18"/>
+        </w:rPr>
+        <w:t>, “Self-Prompting Large Vision Models for Few-Shot Medical Image Segmentation,” arXiv:2308.07624, 2023.</w:t>
       </w:r>
     </w:p>
     <w:p>
       <w:pPr>
-        <w:spacing w:before="0" w:after="40" w:line="240" w:lineRule="auto"/>
+        <w:spacing w:after="40"/>
+        <w:rPr>
+          <w:rFonts w:ascii="Calibri" w:hAnsi="Calibri"/>
+          <w:sz w:val="18"/>
+        </w:rPr>
       </w:pPr>
       <w:r>
         <w:rPr>
           <w:rFonts w:ascii="Calibri" w:hAnsi="Calibri"/>
-          <w:b w:val="0"/>
           <w:sz w:val="18"/>
         </w:rPr>
-        <w:t>[7] J. Bernal et al., “WM-DOVA Maps for Accurate Polyp Highlighting,” CMIG, 2015.</w:t>
+        <w:t xml:space="preserve">[7] T. </w:t>
+      </w:r>
+      <w:proofErr w:type="spellStart"/>
+      <w:r>
+        <w:rPr>
+          <w:rFonts w:ascii="Calibri" w:hAnsi="Calibri"/>
+          <w:sz w:val="18"/>
+        </w:rPr>
+        <w:t>Shaharabany</w:t>
+      </w:r>
+      <w:proofErr w:type="spellEnd"/>
+      <w:r>
+        <w:rPr>
+          <w:rFonts w:ascii="Calibri" w:hAnsi="Calibri"/>
+          <w:sz w:val="18"/>
+        </w:rPr>
+        <w:t xml:space="preserve"> et al., “</w:t>
+      </w:r>
+      <w:proofErr w:type="spellStart"/>
+      <w:r>
+        <w:rPr>
+          <w:rFonts w:ascii="Calibri" w:hAnsi="Calibri"/>
+          <w:sz w:val="18"/>
+        </w:rPr>
+        <w:t>AutoSAM</w:t>
+      </w:r>
+      <w:proofErr w:type="spellEnd"/>
+      <w:r>
+        <w:rPr>
+          <w:rFonts w:ascii="Calibri" w:hAnsi="Calibri"/>
+          <w:sz w:val="18"/>
+        </w:rPr>
+        <w:t>: Adapting SAM to Medical Images by Overloading the Prompt Encoder,” arXiv:2306.06370, 2023.</w:t>
       </w:r>
     </w:p>
     <w:p>
       <w:pPr>
-        <w:spacing w:before="0" w:after="40" w:line="240" w:lineRule="auto"/>
+        <w:spacing w:after="40"/>
+        <w:rPr>
+          <w:rFonts w:ascii="Calibri" w:hAnsi="Calibri"/>
+          <w:sz w:val="18"/>
+        </w:rPr>
       </w:pPr>
       <w:r>
         <w:rPr>
           <w:rFonts w:ascii="Calibri" w:hAnsi="Calibri"/>
-          <w:b w:val="0"/>
           <w:sz w:val="18"/>
         </w:rPr>
-        <w:t>[8] H. Borgli et al., “HyperKvasir,” Scientific Data, 2020.</w:t>
+        <w:t>[8] D. Jha et al., “Kvasir-SEG: A Segmented Polyp Dataset,” in Proc. MMM, 2020.</w:t>
       </w:r>
     </w:p>
     <w:p>
       <w:pPr>
-        <w:spacing w:before="1100" w:after="0"/>
-        <w:jc w:val="center"/>
+        <w:spacing w:after="40"/>
+        <w:rPr>
+          <w:rFonts w:ascii="Calibri" w:hAnsi="Calibri"/>
+          <w:sz w:val="18"/>
+        </w:rPr>
       </w:pPr>
       <w:r>
         <w:rPr>
           <w:rFonts w:ascii="Calibri" w:hAnsi="Calibri"/>
+          <w:sz w:val="18"/>
+        </w:rPr>
+        <w:t>[9] O. Ronneberger, P. Fischer, and T. Brox, “U-Net: Convolutional Networks for Biomedical Image Segmentation,” in Proc. MICCAI, 2015.</w:t>
+      </w:r>
+    </w:p>
+    <w:p>
+      <w:pPr>
+        <w:spacing w:after="40"/>
+        <w:rPr>
+          <w:rFonts w:ascii="Calibri" w:hAnsi="Calibri"/>
+          <w:sz w:val="18"/>
+        </w:rPr>
+      </w:pPr>
+      <w:r>
+        <w:rPr>
+          <w:rFonts w:ascii="Calibri" w:hAnsi="Calibri"/>
+          <w:sz w:val="18"/>
+        </w:rPr>
+        <w:t xml:space="preserve">[10] J. Bernal et al., “WM-DOVA Maps for Accurate Polyp Highlighting in Colonoscopy: Validation vs. Saliency Maps from Physicians,” </w:t>
+      </w:r>
+      <w:proofErr w:type="spellStart"/>
+      <w:r>
+        <w:rPr>
+          <w:rFonts w:ascii="Calibri" w:hAnsi="Calibri"/>
+          <w:sz w:val="18"/>
+        </w:rPr>
+        <w:t>Comput</w:t>
+      </w:r>
+      <w:proofErr w:type="spellEnd"/>
+      <w:r>
+        <w:rPr>
+          <w:rFonts w:ascii="Calibri" w:hAnsi="Calibri"/>
+          <w:sz w:val="18"/>
+        </w:rPr>
+        <w:t>. Med. Imaging Graph., 2015.</w:t>
+      </w:r>
+    </w:p>
+    <w:p>
+      <w:pPr>
+        <w:spacing w:after="40"/>
+        <w:rPr>
+          <w:rFonts w:ascii="Calibri" w:hAnsi="Calibri"/>
+          <w:sz w:val="18"/>
+        </w:rPr>
+      </w:pPr>
+      <w:r>
+        <w:rPr>
+          <w:rFonts w:ascii="Calibri" w:hAnsi="Calibri"/>
+          <w:sz w:val="18"/>
+        </w:rPr>
+        <w:t xml:space="preserve">[11] H. </w:t>
+      </w:r>
+      <w:proofErr w:type="spellStart"/>
+      <w:r>
+        <w:rPr>
+          <w:rFonts w:ascii="Calibri" w:hAnsi="Calibri"/>
+          <w:sz w:val="18"/>
+        </w:rPr>
+        <w:t>Borgli</w:t>
+      </w:r>
+      <w:proofErr w:type="spellEnd"/>
+      <w:r>
+        <w:rPr>
+          <w:rFonts w:ascii="Calibri" w:hAnsi="Calibri"/>
+          <w:sz w:val="18"/>
+        </w:rPr>
+        <w:t xml:space="preserve"> et al., “</w:t>
+      </w:r>
+      <w:proofErr w:type="spellStart"/>
+      <w:r>
+        <w:rPr>
+          <w:rFonts w:ascii="Calibri" w:hAnsi="Calibri"/>
+          <w:sz w:val="18"/>
+        </w:rPr>
+        <w:t>HyperKvasir</w:t>
+      </w:r>
+      <w:proofErr w:type="spellEnd"/>
+      <w:r>
+        <w:rPr>
+          <w:rFonts w:ascii="Calibri" w:hAnsi="Calibri"/>
+          <w:sz w:val="18"/>
+        </w:rPr>
+        <w:t>, a Comprehensive Multi-Class Image and Video Dataset for Gastrointestinal Endoscopy,” Scientific Data, 2020.</w:t>
+      </w:r>
+    </w:p>
+    <w:p>
+      <w:pPr>
+        <w:spacing w:after="40"/>
+        <w:rPr>
+          <w:rFonts w:ascii="Calibri" w:hAnsi="Calibri"/>
+          <w:sz w:val="18"/>
+        </w:rPr>
+      </w:pPr>
+    </w:p>
+    <w:p>
+      <w:pPr>
+        <w:spacing w:after="40"/>
+        <w:rPr>
+          <w:rFonts w:ascii="Calibri" w:hAnsi="Calibri"/>
+          <w:sz w:val="18"/>
+        </w:rPr>
+      </w:pPr>
+    </w:p>
+    <w:p>
+      <w:pPr>
+        <w:spacing w:before="1100" w:after="0"/>
+        <w:rPr>
+          <w:rFonts w:ascii="Calibri" w:hAnsi="Calibri"/>
           <w:sz w:val="16"/>
         </w:rPr>
-        <w:t>WAIMLAp 2026  |  November 18–20, 2026  |  Lima, Peru  |  waimlap.org</w:t>
-      </w:r>
+      </w:pPr>
     </w:p>
     <w:sectPr>
-      <w:headerReference w:type="default" r:id="rId8"/>
-      <w:footerReference w:type="default" r:id="rId9"/>
+      <w:headerReference w:type="default" r:id="rId9"/>
+      <w:footerReference w:type="default" r:id="rId10"/>
       <w:pgSz w:w="11906" w:h="16838" w:code="9"/>
       <w:pgMar w:top="1134" w:right="1418" w:bottom="1134" w:left="1418" w:header="340" w:footer="340" w:gutter="0"/>
       <w:cols w:space="720"/>
@@ -582,26 +1022,30 @@
 <w:hdr xmlns:wpc="http://schemas.microsoft.com/office/word/2010/wordprocessingCanvas" xmlns:cx="http://schemas.microsoft.com/office/drawing/2014/chartex" xmlns:cx1="http://schemas.microsoft.com/office/drawing/2015/9/8/chartex" xmlns:cx2="http://schemas.microsoft.com/office/drawing/2015/10/21/chartex" xmlns:cx3="http://schemas.microsoft.com/office/drawing/2016/5/9/chartex" xmlns:cx4="http://schemas.microsoft.com/office/drawing/2016/5/10/chartex" xmlns:cx5="http://schemas.microsoft.com/office/drawing/2016/5/11/chartex" xmlns:cx6="http://schemas.microsoft.com/office/drawing/2016/5/12/chartex" xmlns:cx7="http://schemas.microsoft.com/office/drawing/2016/5/13/chartex" xmlns:cx8="http://schemas.microsoft.com/office/drawing/2016/5/14/chartex" xmlns:mc="http://schemas.openxmlformats.org/markup-compatibility/2006" xmlns:aink="http://schemas.microsoft.com/office/drawing/2016/ink" xmlns:am3d="http://schemas.microsoft.com/office/drawing/2017/model3d" xmlns:o="urn:schemas-microsoft-com:office:office" xmlns:oel="http://schemas.microsoft.com/office/2019/extlst" xmlns:r="http://schemas.openxmlformats.org/officeDocument/2006/relationships" xmlns:m="http://schemas.openxmlformats.org/officeDocument/2006/math" xmlns:v="urn:schemas-microsoft-com:vml" xmlns:wp14="http://schemas.microsoft.com/office/word/2010/wordprocessingDrawing" xmlns:wp="http://schemas.openxmlformats.org/drawingml/2006/wordprocessingDrawing" xmlns:w10="urn:schemas-microsoft-com:office:word" xmlns:w="http://schemas.openxmlformats.org/wordprocessingml/2006/main" xmlns:w14="http://schemas.microsoft.com/office/word/2010/wordml" xmlns:w15="http://schemas.microsoft.com/office/word/2012/wordml" xmlns:w16cex="http://schemas.microsoft.com/office/word/2018/wordml/cex" xmlns:w16cid="http://schemas.microsoft.com/office/word/2016/wordml/cid" xmlns:w16="http://schemas.microsoft.com/office/word/2018/wordml" xmlns:w16du="http://schemas.microsoft.com/office/word/2023/wordml/word16du" xmlns:w16sdtdh="http://schemas.microsoft.com/office/word/2020/wordml/sdtdatahash" xmlns:w16sdtfl="http://schemas.microsoft.com/office/word/2024/wordml/sdtformatlock" xmlns:w16se="http://schemas.microsoft.com/office/word/2015/wordml/symex" xmlns:wpg="http://schemas.microsoft.com/office/word/2010/wordprocessingGroup" xmlns:wpi="http://schemas.microsoft.com/office/word/2010/wordprocessingInk" xmlns:wne="http://schemas.microsoft.com/office/word/2006/wordml" xmlns:wps="http://schemas.microsoft.com/office/word/2010/wordprocessingShape" mc:Ignorable="w14 w15 w16se w16cid w16 w16cex w16sdtdh w16sdtfl w16du wp14">
   <w:p>
     <w:pPr>
-      <w:spacing w:before="0" w:after="0"/>
+      <w:spacing w:after="0"/>
       <w:jc w:val="center"/>
     </w:pPr>
     <w:r>
+      <w:rPr>
+        <w:noProof/>
+      </w:rPr>
       <w:drawing>
-        <wp:inline xmlns:a="http://schemas.openxmlformats.org/drawingml/2006/main" xmlns:pic="http://schemas.openxmlformats.org/drawingml/2006/picture">
+        <wp:inline distT="0" distB="0" distL="0" distR="0" wp14:anchorId="4CED4DDE" wp14:editId="46D1183D">
           <wp:extent cx="6263640" cy="549004"/>
-          <wp:docPr id="1" name="Picture 1"/>
+          <wp:effectExtent l="0" t="0" r="0" b="0"/>
+          <wp:docPr id="423807627" name="Picture 1"/>
           <wp:cNvGraphicFramePr>
-            <a:graphicFrameLocks noChangeAspect="1"/>
+            <a:graphicFrameLocks xmlns:a="http://schemas.openxmlformats.org/drawingml/2006/main" noChangeAspect="1"/>
           </wp:cNvGraphicFramePr>
-          <a:graphic>
+          <a:graphic xmlns:a="http://schemas.openxmlformats.org/drawingml/2006/main">
             <a:graphicData uri="http://schemas.openxmlformats.org/drawingml/2006/picture">
-              <pic:pic>
+              <pic:pic xmlns:pic="http://schemas.openxmlformats.org/drawingml/2006/picture">
                 <pic:nvPicPr>
                   <pic:cNvPr id="0" name="header_strip.png"/>
                   <pic:cNvPicPr/>
                 </pic:nvPicPr>
                 <pic:blipFill>
-                  <a:blip r:embed="rId3"/>
+                  <a:blip r:embed="rId1"/>
                   <a:stretch>
                     <a:fillRect/>
                   </a:stretch>
@@ -611,7 +1055,9 @@
                     <a:off x="0" y="0"/>
                     <a:ext cx="6263640" cy="549004"/>
                   </a:xfrm>
-                  <a:prstGeom prst="rect"/>
+                  <a:prstGeom prst="rect">
+                    <a:avLst/>
+                  </a:prstGeom>
                 </pic:spPr>
               </pic:pic>
             </a:graphicData>

</xml_diff>